<commit_message>
wieviel allgemein und negative Anzeigen lassen
</commit_message>
<xml_diff>
--- a/Erklärung.docx
+++ b/Erklärung.docx
@@ -9,7 +9,15 @@
     </w:p>
     <w:p>
       <w:r>
-        <w:t>Einmalige Installation der Voraussetzungen in der genutzen Phyton Umgebung mitttels Eingabe in die Konsole, bei mir direkt in VS Code.</w:t>
+        <w:t xml:space="preserve">Einmalige Installation der Voraussetzungen in der genutzen Phyton Umgebung mitttels Eingabe in die Konsole, bei mir direkt in </w:t>
+      </w:r>
+      <w:proofErr w:type="gramStart"/>
+      <w:r>
+        <w:t>VS Code</w:t>
+      </w:r>
+      <w:proofErr w:type="gramEnd"/>
+      <w:r>
+        <w:t>.</w:t>
       </w:r>
     </w:p>
     <w:p>
@@ -54,6 +62,29 @@
           <w:lang w:val="en-GB"/>
         </w:rPr>
         <w:t>python -m spacy download en_core_web_sm</w:t>
+      </w:r>
+    </w:p>
+    <w:p>
+      <w:pPr>
+        <w:rPr>
+          <w:lang w:val="de-AT"/>
+        </w:rPr>
+      </w:pPr>
+      <w:r>
+        <w:rPr>
+          <w:lang w:val="de-AT"/>
+        </w:rPr>
+        <w:t>und für die Wordcloud noch:</w:t>
+      </w:r>
+    </w:p>
+    <w:p>
+      <w:pPr>
+        <w:rPr>
+          <w:lang w:val="en-GB"/>
+        </w:rPr>
+      </w:pPr>
+      <w:r>
+        <w:t>pip install wordcloud</w:t>
       </w:r>
     </w:p>
     <w:sectPr>
@@ -674,7 +705,6 @@
   <w:style w:type="character" w:default="1" w:styleId="Absatz-Standardschriftart">
     <w:name w:val="Default Paragraph Font"/>
     <w:uiPriority w:val="1"/>
-    <w:semiHidden/>
     <w:unhideWhenUsed/>
   </w:style>
   <w:style w:type="table" w:default="1" w:styleId="NormaleTabelle">

</xml_diff>